<commit_message>
Capitulo 4 Fase I Tecnicas de comunicacion
</commit_message>
<xml_diff>
--- a/LIBRO/Informe de avance Modificado.docx
+++ b/LIBRO/Informe de avance Modificado.docx
@@ -5211,7 +5211,7 @@
         <w:rPr>
           <w:noProof/>
         </w:rPr>
-        <w:t>4</w:t>
+        <w:t>3</w:t>
       </w:r>
       <w:r>
         <w:fldChar w:fldCharType="end"/>
@@ -5414,7 +5414,7 @@
         <w:rPr>
           <w:noProof/>
         </w:rPr>
-        <w:t>5</w:t>
+        <w:t>4</w:t>
       </w:r>
       <w:r>
         <w:fldChar w:fldCharType="end"/>
@@ -5655,7 +5655,7 @@
         <w:rPr>
           <w:noProof/>
         </w:rPr>
-        <w:t>6</w:t>
+        <w:t>5</w:t>
       </w:r>
       <w:r>
         <w:fldChar w:fldCharType="end"/>
@@ -5846,7 +5846,7 @@
         <w:rPr>
           <w:noProof/>
         </w:rPr>
-        <w:t>7</w:t>
+        <w:t>6</w:t>
       </w:r>
       <w:r>
         <w:fldChar w:fldCharType="end"/>
@@ -6085,7 +6085,7 @@
         <w:rPr>
           <w:noProof/>
         </w:rPr>
-        <w:t>8</w:t>
+        <w:t>7</w:t>
       </w:r>
       <w:r>
         <w:fldChar w:fldCharType="end"/>
@@ -6237,7 +6237,7 @@
         <w:rPr>
           <w:noProof/>
         </w:rPr>
-        <w:t>9</w:t>
+        <w:t>8</w:t>
       </w:r>
       <w:r>
         <w:fldChar w:fldCharType="end"/>
@@ -6358,7 +6358,7 @@
         <w:rPr>
           <w:noProof/>
         </w:rPr>
-        <w:t>10</w:t>
+        <w:t>9</w:t>
       </w:r>
       <w:r>
         <w:fldChar w:fldCharType="end"/>
@@ -6494,7 +6494,7 @@
         <w:rPr>
           <w:noProof/>
         </w:rPr>
-        <w:t>11</w:t>
+        <w:t>10</w:t>
       </w:r>
       <w:r>
         <w:fldChar w:fldCharType="end"/>
@@ -6699,7 +6699,7 @@
         <w:rPr>
           <w:noProof/>
         </w:rPr>
-        <w:t>12</w:t>
+        <w:t>11</w:t>
       </w:r>
       <w:r>
         <w:fldChar w:fldCharType="end"/>
@@ -8764,6 +8764,7 @@
         <w:ind w:firstLine="708"/>
       </w:pPr>
       <w:bookmarkStart w:id="81" w:name="_Toc170819912"/>
+      <w:commentRangeStart w:id="82"/>
       <w:r>
         <w:t>S</w:t>
       </w:r>
@@ -8777,7 +8778,18 @@
         <w:t>. La metodología es un componente esencial en cualquier estudio, ya que define el enfoque y los procedimientos utilizados para alcanzar los objetivos planteados.</w:t>
       </w:r>
       <w:r>
-        <w:t xml:space="preserve"> Según </w:t>
+        <w:t xml:space="preserve"> </w:t>
+      </w:r>
+      <w:commentRangeEnd w:id="82"/>
+      <w:r>
+        <w:rPr>
+          <w:rStyle w:val="CommentReference"/>
+          <w:rFonts w:ascii="Aptos" w:hAnsi="Aptos"/>
+        </w:rPr>
+        <w:commentReference w:id="82"/>
+      </w:r>
+      <w:r>
+        <w:t xml:space="preserve">Según </w:t>
       </w:r>
       <w:r>
         <w:t>(</w:t>
@@ -8818,14 +8830,14 @@
       <w:pPr>
         <w:pStyle w:val="Titulo2doNivel"/>
       </w:pPr>
-      <w:bookmarkStart w:id="82" w:name="_Toc1581761813"/>
-      <w:bookmarkStart w:id="83" w:name="_Toc173592432"/>
+      <w:bookmarkStart w:id="83" w:name="_Toc1581761813"/>
+      <w:bookmarkStart w:id="84" w:name="_Toc173592432"/>
       <w:r>
         <w:t>Tipo de investigación</w:t>
       </w:r>
       <w:bookmarkEnd w:id="81"/>
-      <w:bookmarkEnd w:id="82"/>
       <w:bookmarkEnd w:id="83"/>
+      <w:bookmarkEnd w:id="84"/>
     </w:p>
     <w:p>
       <w:pPr>
@@ -8839,16 +8851,16 @@
       <w:pPr>
         <w:pStyle w:val="Titulo2doNivel"/>
       </w:pPr>
-      <w:bookmarkStart w:id="84" w:name="_Toc170819913"/>
-      <w:bookmarkStart w:id="85" w:name="_Toc1043333321"/>
-      <w:bookmarkStart w:id="86" w:name="_Toc173592433"/>
+      <w:bookmarkStart w:id="85" w:name="_Toc170819913"/>
+      <w:bookmarkStart w:id="86" w:name="_Toc1043333321"/>
+      <w:bookmarkStart w:id="87" w:name="_Toc173592433"/>
       <w:r>
         <w:lastRenderedPageBreak/>
         <w:t>Naturaleza de la investigación</w:t>
       </w:r>
-      <w:bookmarkEnd w:id="84"/>
       <w:bookmarkEnd w:id="85"/>
       <w:bookmarkEnd w:id="86"/>
+      <w:bookmarkEnd w:id="87"/>
     </w:p>
     <w:p>
       <w:pPr>
@@ -8862,15 +8874,15 @@
       <w:pPr>
         <w:pStyle w:val="Titulo2doNivel"/>
       </w:pPr>
-      <w:bookmarkStart w:id="87" w:name="_Toc170819914"/>
-      <w:bookmarkStart w:id="88" w:name="_Toc241825522"/>
-      <w:bookmarkStart w:id="89" w:name="_Toc173592434"/>
+      <w:bookmarkStart w:id="88" w:name="_Toc170819914"/>
+      <w:bookmarkStart w:id="89" w:name="_Toc241825522"/>
+      <w:bookmarkStart w:id="90" w:name="_Toc173592434"/>
       <w:r>
         <w:t>Diseño de la investigación</w:t>
       </w:r>
-      <w:bookmarkEnd w:id="87"/>
       <w:bookmarkEnd w:id="88"/>
       <w:bookmarkEnd w:id="89"/>
+      <w:bookmarkEnd w:id="90"/>
     </w:p>
     <w:p>
       <w:pPr>
@@ -8895,7 +8907,10 @@
         </w:numPr>
       </w:pPr>
       <w:r>
-        <w:t xml:space="preserve">Etapa de diagnóstico: en esta etapa se </w:t>
+        <w:t>Fase I</w:t>
+      </w:r>
+      <w:r>
+        <w:t xml:space="preserve"> diagnóstico: en esta etapa se </w:t>
       </w:r>
       <w:r>
         <w:t>desea</w:t>
@@ -8907,7 +8922,7 @@
         <w:t xml:space="preserve"> y se</w:t>
       </w:r>
       <w:r>
-        <w:t xml:space="preserve"> realizará la investigación teórica de los temas y aspectos que se ameriten para la implementación de las posibles soluciones y diseños. La presente etapa corresponde al alcance del objetivo 1. </w:t>
+        <w:t xml:space="preserve"> realiza la investigación teórica de los temas y aspectos que se ameriten para la implementación de las posibles soluciones y diseños. La presente etapa corresponde al alcance del objetivo 1. </w:t>
       </w:r>
     </w:p>
     <w:p>
@@ -8919,7 +8934,10 @@
         </w:numPr>
       </w:pPr>
       <w:r>
-        <w:t xml:space="preserve">Etapa de diseño: en esta etapa se ejecuta las tareas y actividades relacionadas con el diseño electrónico, software y hardware; buscando realizar un bosquejo de los </w:t>
+        <w:t>Fase II</w:t>
+      </w:r>
+      <w:r>
+        <w:t xml:space="preserve"> diseño: en esta etapa se ejecuta las tareas y actividades relacionadas con el diseño electrónico, software y hardware; buscando realizar un bosquejo de los </w:t>
       </w:r>
       <w:r>
         <w:t>componentes</w:t>
@@ -8938,7 +8956,31 @@
       </w:pPr>
       <w:r>
         <w:lastRenderedPageBreak/>
-        <w:t>Implementación: en esta etapa se colocará en marcha todo lo definido en la etapa de diseño, donde se adquirirán y ensamblaran los módulos, componentes, sensores, microcontroladores y actuadores seleccionados, se desarrollará la programación del software que controlará el hardware, y se harán todos los cambios necesarios para el funcionamiento del sistema. Esta etapa indica la finalización de los objetivos 2 al 4.</w:t>
+        <w:t>Fase III I</w:t>
+      </w:r>
+      <w:r>
+        <w:t xml:space="preserve">mplementación: en esta etapa se coloca en marcha todo lo definido en la etapa de diseño, donde se </w:t>
+      </w:r>
+      <w:r>
+        <w:t>adquie</w:t>
+      </w:r>
+      <w:r>
+        <w:t xml:space="preserve">ren </w:t>
+      </w:r>
+      <w:r>
+        <w:t>y ensambla</w:t>
+      </w:r>
+      <w:r>
+        <w:t>n</w:t>
+      </w:r>
+      <w:r>
+        <w:t xml:space="preserve"> los módulos, componentes, sensores, microcontroladores y actuadores seleccionados, se desarrolla la programación del software que controla el hardware, y se </w:t>
+      </w:r>
+      <w:r>
+        <w:t>realizan</w:t>
+      </w:r>
+      <w:r>
+        <w:t xml:space="preserve"> todos los cambios necesarios para el funcionamiento del sistema. Esta etapa indica la finalización de los objetivos 2 al 4.</w:t>
       </w:r>
     </w:p>
     <w:p>
@@ -8950,18 +8992,27 @@
         </w:numPr>
       </w:pPr>
       <w:r>
-        <w:t>Verificación: en la presente etapa se realizarán las pruebas necesarias para comprobar el correcto funcionamiento del prototipo, que cumpla todas sus funciones según lo diseñado, se corregirán los errores presentados y se documentará desempeño en diferentes condiciones de dicho dispositivo. En esta etapa se llevaría a cabo el objetivo 5.</w:t>
+        <w:t>Fase IV V</w:t>
+      </w:r>
+      <w:r>
+        <w:t>erificación: en la presente etapa se realiza las pruebas necesarias para comprobar el correcto funcionamiento del prototipo, que cumpla todas sus funciones según lo diseñado, se corregirán los errores presentados y se documenta</w:t>
+      </w:r>
+      <w:r>
+        <w:t xml:space="preserve"> </w:t>
+      </w:r>
+      <w:r>
+        <w:t>desempeño en diferentes condiciones de dicho dispositivo. En esta etapa se llevaría a cabo el objetivo 5.</w:t>
       </w:r>
     </w:p>
     <w:p>
       <w:pPr>
         <w:pStyle w:val="Titulo3erNivel"/>
       </w:pPr>
-      <w:bookmarkStart w:id="90" w:name="_Toc277649981"/>
+      <w:bookmarkStart w:id="91" w:name="_Toc277649981"/>
       <w:r>
         <w:t>Fase I Diagnostico</w:t>
       </w:r>
-      <w:bookmarkEnd w:id="90"/>
+      <w:bookmarkEnd w:id="91"/>
       <w:r>
         <w:t xml:space="preserve"> </w:t>
       </w:r>
@@ -9048,11 +9099,11 @@
       <w:r>
         <w:t xml:space="preserve">¿Qué variable es la más apropiada de controlar para identificar una emergencia de una persona y cómo </w:t>
       </w:r>
-      <w:bookmarkStart w:id="91" w:name="_Int_9dt6mqGX"/>
+      <w:bookmarkStart w:id="92" w:name="_Int_9dt6mqGX"/>
       <w:r>
         <w:t>sensarla</w:t>
       </w:r>
-      <w:bookmarkEnd w:id="91"/>
+      <w:bookmarkEnd w:id="92"/>
       <w:r>
         <w:t>?</w:t>
       </w:r>
@@ -9070,11 +9121,11 @@
       <w:pPr>
         <w:pStyle w:val="Titulo3erNivel"/>
       </w:pPr>
-      <w:bookmarkStart w:id="92" w:name="_Toc1387339525"/>
+      <w:bookmarkStart w:id="93" w:name="_Toc1387339525"/>
       <w:r>
         <w:t>Fase II Diseño</w:t>
       </w:r>
-      <w:bookmarkEnd w:id="92"/>
+      <w:bookmarkEnd w:id="93"/>
       <w:r>
         <w:t xml:space="preserve"> </w:t>
       </w:r>
@@ -9132,12 +9183,12 @@
       <w:pPr>
         <w:pStyle w:val="Titulo3erNivel"/>
       </w:pPr>
-      <w:bookmarkStart w:id="93" w:name="_Toc1806498180"/>
+      <w:bookmarkStart w:id="94" w:name="_Toc1806498180"/>
       <w:r>
         <w:lastRenderedPageBreak/>
         <w:t>Fase III Implementación</w:t>
       </w:r>
-      <w:bookmarkEnd w:id="93"/>
+      <w:bookmarkEnd w:id="94"/>
       <w:r>
         <w:t xml:space="preserve"> </w:t>
       </w:r>
@@ -9179,11 +9230,11 @@
       <w:pPr>
         <w:pStyle w:val="Titulo3erNivel"/>
       </w:pPr>
-      <w:bookmarkStart w:id="94" w:name="_Toc491086328"/>
+      <w:bookmarkStart w:id="95" w:name="_Toc491086328"/>
       <w:r>
         <w:t>Fase IV Verificación</w:t>
       </w:r>
-      <w:bookmarkEnd w:id="94"/>
+      <w:bookmarkEnd w:id="95"/>
       <w:r>
         <w:t xml:space="preserve"> </w:t>
       </w:r>
@@ -9349,6 +9400,14 @@
       </w:pPr>
       <w:r>
         <w:t xml:space="preserve">Fase I Diagnostico </w:t>
+      </w:r>
+    </w:p>
+    <w:p>
+      <w:pPr>
+        <w:pStyle w:val="Parrafos"/>
+      </w:pPr>
+      <w:r>
+        <w:t>La primera fase de la investigación tuvo como propósito identificar las características específicas del problema y establecer los requerimientos técnicos necesarios para el diseño del prototipo. Para ello, se formularon preguntas orientadoras relacionadas con la comunicación a larga distancia, la geolocalización, el procesamiento de datos, la reproducción de audio y la detección de emergencias.</w:t>
       </w:r>
     </w:p>
     <w:p>
@@ -9368,6 +9427,7 @@
           <w:b/>
           <w:bCs/>
         </w:rPr>
+        <w:lastRenderedPageBreak/>
         <w:t>Técnica</w:t>
       </w:r>
       <w:r>
@@ -9413,125 +9473,76 @@
         </w:tabs>
       </w:pPr>
       <w:r>
+        <w:t>S</w:t>
+      </w:r>
+      <w:r>
+        <w:t>e evaluaron distintas alternativas de comunicación inalámbrica, priorizando dos criterios fundamentales: alcance de transmisión y fiabilidad de la comunicación.</w:t>
+      </w:r>
+    </w:p>
+    <w:p>
+      <w:pPr>
+        <w:pStyle w:val="Parrafos"/>
+        <w:tabs>
+          <w:tab w:val="left" w:pos="3299"/>
+        </w:tabs>
+      </w:pPr>
+      <w:r>
+        <w:t>La</w:t>
+      </w:r>
+      <w:r>
+        <w:t xml:space="preserve"> primera alternativa de comunicación evaluada fue la tecnología GSM, implementada mediante el módulo SIM800L. Para su validación se realizaron pruebas con tarjetas SIM de los operadores nacionales Movistar y Movilnet, verificándose que el módulo reconocía correctamente las tarjetas y ejecutaba las rutinas básicas de inicialización a través de comandos AT. Sin embargo, no logró registrarse en la red móvil debido a que este dispositivo opera exclusivamente sobre infraestructura 2G (GSM/GPRS), estándar que ha sido descontinuado por la mayoría de los operadores en Venezuela.</w:t>
+      </w:r>
+    </w:p>
+    <w:p>
+      <w:pPr>
+        <w:pStyle w:val="Parrafos"/>
+        <w:tabs>
+          <w:tab w:val="left" w:pos="3299"/>
+        </w:tabs>
+      </w:pPr>
+      <w:r>
+        <w:t>Incluso en zonas con cobertura confirmada de Movilnet, donde se constató la presencia de señal mediante terminales móviles, el módulo no consiguió establecer enlace con la red, lo que evidenció su incompatibilidad con la infraestructura de telecomunicaciones vigente en el país. Este resultado permitió concluir que el SIM800L no es una opción viable para el proyecto, y que, en caso de requerirse comunicación celular, sería necesario migrar hacia módulos compatibles con 3G o 4G, considerando como limitantes el mayor costo, consumo energético y dimensiones físicas de estos dispositivos en comparación con las soluciones 2G.</w:t>
+      </w:r>
+    </w:p>
+    <w:p>
+      <w:pPr>
+        <w:pStyle w:val="Parrafos"/>
+        <w:tabs>
+          <w:tab w:val="left" w:pos="3299"/>
+        </w:tabs>
+      </w:pPr>
+      <w:r>
+        <w:t>Seguidamente, s</w:t>
+      </w:r>
+      <w:r>
+        <w:t>e evaluaron distintas alternativas de comunicación inalámbrica</w:t>
+      </w:r>
+      <w:r>
+        <w:t xml:space="preserve"> más modernas</w:t>
+      </w:r>
+      <w:r>
+        <w:t xml:space="preserve"> y dentro de los alcances del proyecto</w:t>
+      </w:r>
+      <w:r>
+        <w:t xml:space="preserve">. Inicialmente se realizaron pruebas con los módulos </w:t>
+      </w:r>
+      <w:proofErr w:type="spellStart"/>
+      <w:r>
+        <w:t>Reyax</w:t>
+      </w:r>
+      <w:proofErr w:type="spellEnd"/>
+      <w:r>
+        <w:t xml:space="preserve"> RYLR998, los cuales operan en la banda de 915 MHz y ofrecen una configuración sencilla mediante comandos AT. Sin embargo, los resultados obtenidos no </w:t>
+      </w:r>
+      <w:r>
         <w:lastRenderedPageBreak/>
-        <w:t xml:space="preserve">Debido a que </w:t>
-      </w:r>
-      <w:r>
-        <w:t xml:space="preserve">el </w:t>
-      </w:r>
-      <w:r>
-        <w:t>prototipo</w:t>
-      </w:r>
-      <w:r>
-        <w:t xml:space="preserve"> se quiere implementar </w:t>
-      </w:r>
-      <w:r>
-        <w:t xml:space="preserve">tomando como prioridad la distancia a alcanzar y </w:t>
-      </w:r>
-      <w:r>
-        <w:t>la</w:t>
-      </w:r>
-      <w:r>
-        <w:t xml:space="preserve"> fiabilidad de la </w:t>
-      </w:r>
-      <w:r>
-        <w:t>comunicación</w:t>
-      </w:r>
-      <w:r>
-        <w:t xml:space="preserve">, se </w:t>
-      </w:r>
-      <w:r>
-        <w:t xml:space="preserve">seleccionó </w:t>
-      </w:r>
-      <w:r>
-        <w:t>los módulos LoRa,</w:t>
-      </w:r>
-      <w:r>
-        <w:t xml:space="preserve"> </w:t>
-      </w:r>
-      <w:r>
-        <w:t>más</w:t>
-      </w:r>
-      <w:r>
-        <w:t xml:space="preserve"> específicamente se opta por usar los Chips </w:t>
-      </w:r>
-      <w:r>
-        <w:rPr>
-          <w:rFonts w:hint="eastAsia"/>
-        </w:rPr>
-        <w:t>Core1262-HF</w:t>
-      </w:r>
-      <w:r>
-        <w:t xml:space="preserve"> los cuales tiene</w:t>
-      </w:r>
-      <w:r>
-        <w:t>n incorporado los chips</w:t>
-      </w:r>
-      <w:r>
-        <w:t xml:space="preserve"> SX1262 de </w:t>
-      </w:r>
-      <w:proofErr w:type="spellStart"/>
-      <w:r>
-        <w:t>Semtec</w:t>
-      </w:r>
-      <w:r>
-        <w:t>h</w:t>
-      </w:r>
-      <w:proofErr w:type="spellEnd"/>
-      <w:r>
-        <w:t>.</w:t>
-      </w:r>
-      <w:r>
-        <w:t xml:space="preserve"> </w:t>
-      </w:r>
-      <w:r>
-        <w:t>Anteriormente</w:t>
-      </w:r>
-      <w:r>
-        <w:t xml:space="preserve"> se realizaron pruebas con </w:t>
-      </w:r>
-      <w:r>
-        <w:t>módulos</w:t>
-      </w:r>
-      <w:r>
-        <w:t xml:space="preserve"> </w:t>
-      </w:r>
-      <w:proofErr w:type="spellStart"/>
-      <w:r>
-        <w:t>Reyax</w:t>
-      </w:r>
-      <w:proofErr w:type="spellEnd"/>
-      <w:r>
-        <w:t xml:space="preserve"> RYLR998 </w:t>
-      </w:r>
-      <w:r>
-        <w:t>sin emba</w:t>
-      </w:r>
-      <w:r>
-        <w:t xml:space="preserve">rgo los resultados obtenidos no fueron los mejores. En </w:t>
-      </w:r>
-      <w:r>
-        <w:t>la figura</w:t>
-      </w:r>
-      <w:r>
-        <w:t xml:space="preserve"> </w:t>
-      </w:r>
-      <w:r>
-        <w:t xml:space="preserve">XX se muestra </w:t>
-      </w:r>
-      <w:r>
-        <w:t xml:space="preserve">el recorrido máximo que se tuvo con estos </w:t>
-      </w:r>
-      <w:r>
-        <w:t>módulos</w:t>
-      </w:r>
-      <w:r>
-        <w:t>.</w:t>
-      </w:r>
-    </w:p>
-    <w:p>
-      <w:pPr>
-        <w:pStyle w:val="Parrafos"/>
+        <w:t>fueron los más satisfactorios, especialmente en lo referente a la distancia efectiva de transmisión y la flexibilidad de parámetros de radiofrecuencia.</w:t>
+      </w:r>
+    </w:p>
+    <w:p>
+      <w:pPr>
+        <w:pStyle w:val="Parrafos"/>
+        <w:keepNext/>
         <w:tabs>
           <w:tab w:val="left" w:pos="3299"/>
         </w:tabs>
@@ -9542,10 +9553,10 @@
           <w:noProof/>
         </w:rPr>
         <w:drawing>
-          <wp:inline distT="0" distB="0" distL="0" distR="0" wp14:anchorId="155DC23D" wp14:editId="257F8002">
+          <wp:inline distT="0" distB="0" distL="0" distR="0" wp14:anchorId="6D843E5F" wp14:editId="0559AC17">
             <wp:extent cx="3437919" cy="2525323"/>
             <wp:effectExtent l="0" t="0" r="0" b="8890"/>
-            <wp:docPr id="7" name="Imagen 7" descr="RYLR998｜REYAX TECHNOLOGY"/>
+            <wp:docPr id="859966748" name="Imagen 7" descr="RYLR998｜REYAX TECHNOLOGY"/>
             <wp:cNvGraphicFramePr>
               <a:graphicFrameLocks xmlns:a="http://schemas.openxmlformats.org/drawingml/2006/main" noChangeAspect="1"/>
             </wp:cNvGraphicFramePr>
@@ -9559,7 +9570,7 @@
                     </pic:cNvPicPr>
                   </pic:nvPicPr>
                   <pic:blipFill>
-                    <a:blip r:embed="rId25">
+                    <a:blip r:embed="rId29">
                       <a:extLst>
                         <a:ext uri="{28A0092B-C50C-407E-A947-70E740481C1C}">
                           <a14:useLocalDpi xmlns:a14="http://schemas.microsoft.com/office/drawing/2010/main" val="0"/>
@@ -9593,15 +9604,66 @@
     </w:p>
     <w:p>
       <w:pPr>
+        <w:pStyle w:val="Caption"/>
+        <w:jc w:val="center"/>
+      </w:pPr>
+      <w:r>
+        <w:t xml:space="preserve">Figure </w:t>
+      </w:r>
+      <w:r>
+        <w:fldChar w:fldCharType="begin"/>
+      </w:r>
+      <w:r>
+        <w:instrText xml:space="preserve"> SEQ Figure \* ARABIC </w:instrText>
+      </w:r>
+      <w:r>
+        <w:fldChar w:fldCharType="separate"/>
+      </w:r>
+      <w:r>
+        <w:rPr>
+          <w:noProof/>
+        </w:rPr>
+        <w:t>12</w:t>
+      </w:r>
+      <w:r>
+        <w:fldChar w:fldCharType="end"/>
+      </w:r>
+      <w:r>
+        <w:t>. RYLR998</w:t>
+      </w:r>
+    </w:p>
+    <w:p>
+      <w:pPr>
         <w:pStyle w:val="Parrafos"/>
         <w:tabs>
           <w:tab w:val="left" w:pos="3299"/>
         </w:tabs>
-      </w:pPr>
-    </w:p>
-    <w:p>
-      <w:pPr>
-        <w:pStyle w:val="Parrafos"/>
+        <w:jc w:val="center"/>
+      </w:pPr>
+      <w:r>
+        <w:t xml:space="preserve">Posteriormente se incorporaron los módulos Core1262-HF, basados en el chip SX1262 de </w:t>
+      </w:r>
+      <w:proofErr w:type="spellStart"/>
+      <w:r>
+        <w:t>Semtech</w:t>
+      </w:r>
+      <w:proofErr w:type="spellEnd"/>
+      <w:r>
+        <w:t>, los cuales demostraron un desempeño superior en varios aspectos técnicos. La comparación entre ambos dispositivos permitió identificar los siguientes puntos relevantes:</w:t>
+      </w:r>
+    </w:p>
+    <w:p>
+      <w:pPr>
+        <w:pStyle w:val="Parrafos"/>
+        <w:tabs>
+          <w:tab w:val="left" w:pos="3299"/>
+        </w:tabs>
+      </w:pPr>
+    </w:p>
+    <w:p>
+      <w:pPr>
+        <w:pStyle w:val="Parrafos"/>
+        <w:keepNext/>
         <w:tabs>
           <w:tab w:val="left" w:pos="3299"/>
         </w:tabs>
@@ -9630,7 +9692,7 @@
                     </pic:cNvPicPr>
                   </pic:nvPicPr>
                   <pic:blipFill>
-                    <a:blip r:embed="rId26">
+                    <a:blip r:embed="rId30">
                       <a:extLst>
                         <a:ext uri="{28A0092B-C50C-407E-A947-70E740481C1C}">
                           <a14:useLocalDpi xmlns:a14="http://schemas.microsoft.com/office/drawing/2010/main" val="0"/>
@@ -9664,6 +9726,156 @@
     </w:p>
     <w:p>
       <w:pPr>
+        <w:pStyle w:val="Caption"/>
+        <w:jc w:val="center"/>
+      </w:pPr>
+      <w:r>
+        <w:t xml:space="preserve">Figure </w:t>
+      </w:r>
+      <w:r>
+        <w:fldChar w:fldCharType="begin"/>
+      </w:r>
+      <w:r>
+        <w:instrText xml:space="preserve"> SEQ Figure \* ARABIC </w:instrText>
+      </w:r>
+      <w:r>
+        <w:fldChar w:fldCharType="separate"/>
+      </w:r>
+      <w:r>
+        <w:rPr>
+          <w:noProof/>
+        </w:rPr>
+        <w:t>13</w:t>
+      </w:r>
+      <w:r>
+        <w:fldChar w:fldCharType="end"/>
+      </w:r>
+      <w:r>
+        <w:t>. SX1262</w:t>
+      </w:r>
+    </w:p>
+    <w:p>
+      <w:pPr>
+        <w:pStyle w:val="Parrafos"/>
+        <w:numPr>
+          <w:ilvl w:val="0"/>
+          <w:numId w:val="9"/>
+        </w:numPr>
+        <w:tabs>
+          <w:tab w:val="left" w:pos="3299"/>
+        </w:tabs>
+      </w:pPr>
+      <w:r>
+        <w:t>Frecuencia de operación: ambos módulos cumplen con el requisito de trabajar en la banda de 915 MHz, por lo que este parámetro no representó un factor diferenciador.</w:t>
+      </w:r>
+    </w:p>
+    <w:p>
+      <w:pPr>
+        <w:pStyle w:val="Parrafos"/>
+        <w:numPr>
+          <w:ilvl w:val="0"/>
+          <w:numId w:val="9"/>
+        </w:numPr>
+        <w:tabs>
+          <w:tab w:val="left" w:pos="3299"/>
+        </w:tabs>
+      </w:pPr>
+      <w:r>
+        <w:t>Potencia de transmisión: el SX1262 ofrece una potencia máxima superior (+22 dBm frente a +20 dBm del RYLR998), lo que se tradujo en un mayor alcance comprobado empíricamente durante las pruebas de campo.</w:t>
+      </w:r>
+    </w:p>
+    <w:p>
+      <w:pPr>
+        <w:pStyle w:val="Parrafos"/>
+        <w:numPr>
+          <w:ilvl w:val="0"/>
+          <w:numId w:val="9"/>
+        </w:numPr>
+        <w:tabs>
+          <w:tab w:val="left" w:pos="3299"/>
+        </w:tabs>
+      </w:pPr>
+      <w:r>
+        <w:t>Sensibilidad de recepción: el SX1262 mostró una sensibilidad más alta, evidenciada en la capacidad de recibir datos aun cuando la señal llegaba con menor potencia en comparación con el RYLR998.</w:t>
+      </w:r>
+    </w:p>
+    <w:p>
+      <w:pPr>
+        <w:pStyle w:val="Parrafos"/>
+        <w:numPr>
+          <w:ilvl w:val="0"/>
+          <w:numId w:val="9"/>
+        </w:numPr>
+        <w:tabs>
+          <w:tab w:val="left" w:pos="3299"/>
+        </w:tabs>
+      </w:pPr>
+      <w:r>
+        <w:t>Alcance teórico y práctico: aunque ambos módulos presentan alcances teóricos similares, las pruebas realizadas confirmaron que el SX1262 alcanzó distancias mayores y con mayor estabilidad en la comunicación.</w:t>
+      </w:r>
+    </w:p>
+    <w:p>
+      <w:pPr>
+        <w:pStyle w:val="Parrafos"/>
+        <w:numPr>
+          <w:ilvl w:val="0"/>
+          <w:numId w:val="10"/>
+        </w:numPr>
+        <w:tabs>
+          <w:tab w:val="left" w:pos="3299"/>
+        </w:tabs>
+      </w:pPr>
+      <w:r>
+        <w:t xml:space="preserve">Consumo energético: en transmisión y recepción, el RYLR998 mostró un consumo más bajo, lo cual constituye una ventaja en términos de eficiencia energética. No </w:t>
+      </w:r>
+      <w:r>
+        <w:lastRenderedPageBreak/>
+        <w:t>obstante, este factor no resultó determinante, dado que el dispositivo está diseñado para transmitir de manera continua y la prioridad se centró en la fiabilidad de la comunicación.</w:t>
+      </w:r>
+    </w:p>
+    <w:p>
+      <w:pPr>
+        <w:pStyle w:val="Parrafos"/>
+        <w:numPr>
+          <w:ilvl w:val="0"/>
+          <w:numId w:val="10"/>
+        </w:numPr>
+        <w:tabs>
+          <w:tab w:val="left" w:pos="3299"/>
+        </w:tabs>
+      </w:pPr>
+      <w:r>
+        <w:t>Antena: se comprobó que la calidad y tipo de antena influyen significativamente en la distancia de transmisión. El SX1262 permitió mayor flexibilidad en la selección de antenas externas, lo que contribuyó a optimizar el alcance.</w:t>
+      </w:r>
+    </w:p>
+    <w:p>
+      <w:pPr>
+        <w:pStyle w:val="Parrafos"/>
+        <w:numPr>
+          <w:ilvl w:val="0"/>
+          <w:numId w:val="10"/>
+        </w:numPr>
+        <w:tabs>
+          <w:tab w:val="left" w:pos="3299"/>
+        </w:tabs>
+      </w:pPr>
+      <w:r>
+        <w:t>Flexibilidad de parámetros RF: este fue uno de los aspectos más determinantes. El SX1262 permitió ajustar parámetros como el ancho de banda, el factor de dispersión y la tasa de codificación, lo que posibilitó alcanzar mayores distancias y adaptar la comunicación a diferentes condiciones de entorno.</w:t>
+      </w:r>
+    </w:p>
+    <w:p>
+      <w:pPr>
+        <w:pStyle w:val="Parrafos"/>
+        <w:tabs>
+          <w:tab w:val="left" w:pos="3299"/>
+        </w:tabs>
+      </w:pPr>
+      <w:r>
+        <w:t>En conclusión, aunque el módulo RYLR998 presentó ventajas en consumo energético y simplicidad de configuración, el SX1262 se consolidó como la opción más adecuada para el prototipo, al ofrecer mayor alcance, mejor sensibilidad y mayor flexibilidad de configuración, factores que responden directamente a la necesidad de garantizar una comunicación confiable en escenarios de uso real.</w:t>
+      </w:r>
+    </w:p>
+    <w:p>
+      <w:pPr>
         <w:pStyle w:val="Parrafos"/>
         <w:tabs>
           <w:tab w:val="left" w:pos="3299"/>
@@ -9764,6 +9976,7 @@
         </w:tabs>
       </w:pPr>
       <w:r>
+        <w:lastRenderedPageBreak/>
         <w:t xml:space="preserve"> El </w:t>
       </w:r>
       <w:r>
@@ -9812,7 +10025,6 @@
         <w:rPr>
           <w:noProof/>
         </w:rPr>
-        <w:lastRenderedPageBreak/>
         <w:drawing>
           <wp:inline distT="0" distB="0" distL="0" distR="0" wp14:anchorId="6C24B398" wp14:editId="528E29CF">
             <wp:extent cx="3040912" cy="3040912"/>
@@ -9831,7 +10043,7 @@
                     </pic:cNvPicPr>
                   </pic:nvPicPr>
                   <pic:blipFill>
-                    <a:blip r:embed="rId27" cstate="print">
+                    <a:blip r:embed="rId31" cstate="print">
                       <a:extLst>
                         <a:ext uri="{28A0092B-C50C-407E-A947-70E740481C1C}">
                           <a14:useLocalDpi xmlns:a14="http://schemas.microsoft.com/office/drawing/2010/main" val="0"/>
@@ -10061,7 +10273,7 @@
                     </pic:cNvPicPr>
                   </pic:nvPicPr>
                   <pic:blipFill>
-                    <a:blip r:embed="rId28">
+                    <a:blip r:embed="rId32">
                       <a:extLst>
                         <a:ext uri="{28A0092B-C50C-407E-A947-70E740481C1C}">
                           <a14:useLocalDpi xmlns:a14="http://schemas.microsoft.com/office/drawing/2010/main" val="0"/>
@@ -10775,18 +10987,18 @@
           <w:highlight w:val="red"/>
         </w:rPr>
       </w:pPr>
-      <w:bookmarkStart w:id="95" w:name="_Toc170819915"/>
-      <w:bookmarkStart w:id="96" w:name="_Toc660348512"/>
-      <w:bookmarkStart w:id="97" w:name="_Toc173592435"/>
+      <w:bookmarkStart w:id="96" w:name="_Toc170819915"/>
+      <w:bookmarkStart w:id="97" w:name="_Toc660348512"/>
+      <w:bookmarkStart w:id="98" w:name="_Toc173592435"/>
       <w:r>
         <w:rPr>
           <w:highlight w:val="red"/>
         </w:rPr>
         <w:t>Diagrama de eventos</w:t>
       </w:r>
-      <w:bookmarkEnd w:id="95"/>
       <w:bookmarkEnd w:id="96"/>
       <w:bookmarkEnd w:id="97"/>
+      <w:bookmarkEnd w:id="98"/>
     </w:p>
     <w:p>
       <w:pPr>
@@ -10856,7 +11068,7 @@
                     <pic:cNvPicPr/>
                   </pic:nvPicPr>
                   <pic:blipFill>
-                    <a:blip r:embed="rId29" cstate="print">
+                    <a:blip r:embed="rId33" cstate="print">
                       <a:extLst>
                         <a:ext uri="{28A0092B-C50C-407E-A947-70E740481C1C}">
                           <a14:useLocalDpi xmlns:a14="http://schemas.microsoft.com/office/drawing/2010/main" val="0"/>
@@ -10891,14 +11103,14 @@
           <w:highlight w:val="red"/>
         </w:rPr>
       </w:pPr>
-      <w:bookmarkStart w:id="98" w:name="_Toc173864086"/>
+      <w:bookmarkStart w:id="99" w:name="_Toc173864086"/>
       <w:r>
         <w:rPr>
           <w:highlight w:val="red"/>
         </w:rPr>
         <w:t>Tabla 2 Primeras 8 semanas del cronograma para el proyecto</w:t>
       </w:r>
-      <w:bookmarkEnd w:id="98"/>
+      <w:bookmarkEnd w:id="99"/>
     </w:p>
     <w:p>
       <w:pPr>
@@ -10950,7 +11162,7 @@
                     <pic:cNvPicPr/>
                   </pic:nvPicPr>
                   <pic:blipFill>
-                    <a:blip r:embed="rId30">
+                    <a:blip r:embed="rId34">
                       <a:extLst>
                         <a:ext uri="{28A0092B-C50C-407E-A947-70E740481C1C}">
                           <a14:useLocalDpi xmlns:a14="http://schemas.microsoft.com/office/drawing/2010/main" val="0"/>
@@ -10985,14 +11197,14 @@
           <w:highlight w:val="red"/>
         </w:rPr>
       </w:pPr>
-      <w:bookmarkStart w:id="99" w:name="_Toc173864087"/>
+      <w:bookmarkStart w:id="100" w:name="_Toc173864087"/>
       <w:r>
         <w:rPr>
           <w:highlight w:val="red"/>
         </w:rPr>
         <w:t>Tabla 3. Últimas 8 semanas del cronograma para el proyecto</w:t>
       </w:r>
-      <w:bookmarkEnd w:id="99"/>
+      <w:bookmarkEnd w:id="100"/>
     </w:p>
     <w:p>
       <w:pPr>
@@ -11001,9 +11213,9 @@
           <w:highlight w:val="red"/>
         </w:rPr>
       </w:pPr>
-      <w:bookmarkStart w:id="100" w:name="_Toc170819916"/>
-      <w:bookmarkStart w:id="101" w:name="_Toc71021469"/>
-      <w:bookmarkStart w:id="102" w:name="_Toc173592436"/>
+      <w:bookmarkStart w:id="101" w:name="_Toc170819916"/>
+      <w:bookmarkStart w:id="102" w:name="_Toc71021469"/>
+      <w:bookmarkStart w:id="103" w:name="_Toc173592436"/>
       <w:r>
         <w:rPr>
           <w:highlight w:val="red"/>
@@ -11011,9 +11223,9 @@
         <w:lastRenderedPageBreak/>
         <w:t>Resultados Esperados</w:t>
       </w:r>
-      <w:bookmarkEnd w:id="100"/>
       <w:bookmarkEnd w:id="101"/>
       <w:bookmarkEnd w:id="102"/>
+      <w:bookmarkEnd w:id="103"/>
     </w:p>
     <w:p>
       <w:pPr>
@@ -11188,12 +11400,12 @@
       <w:pPr>
         <w:pStyle w:val="TITULOS"/>
       </w:pPr>
-      <w:bookmarkStart w:id="103" w:name="_Toc173592437"/>
+      <w:bookmarkStart w:id="104" w:name="_Toc173592437"/>
       <w:r>
         <w:lastRenderedPageBreak/>
         <w:t>Referencias Bibliográficas</w:t>
       </w:r>
-      <w:bookmarkEnd w:id="103"/>
+      <w:bookmarkEnd w:id="104"/>
     </w:p>
     <w:p>
       <w:pPr>
@@ -11254,7 +11466,7 @@
       <w:r>
         <w:t xml:space="preserve">. Recuperado de </w:t>
       </w:r>
-      <w:hyperlink r:id="rId31" w:anchor=":~:text=La%20historia%20de%20LoRa%20comenz%C3%B3,convertir%20la%20idea%20en%20realidad">
+      <w:hyperlink r:id="rId35" w:anchor=":~:text=La%20historia%20de%20LoRa%20comenz%C3%B3,convertir%20la%20idea%20en%20realidad">
         <w:r>
           <w:rPr>
             <w:rStyle w:val="Hyperlink"/>
@@ -11304,7 +11516,7 @@
         </w:rPr>
         <w:t xml:space="preserve">. Disponible en: </w:t>
       </w:r>
-      <w:hyperlink r:id="rId32">
+      <w:hyperlink r:id="rId36">
         <w:r>
           <w:rPr>
             <w:rStyle w:val="Hyperlink"/>
@@ -11366,7 +11578,7 @@
         </w:rPr>
         <w:t xml:space="preserve">Ed. Boston. </w:t>
       </w:r>
-      <w:hyperlink r:id="rId33" w:history="1">
+      <w:hyperlink r:id="rId37" w:history="1">
         <w:r>
           <w:rPr>
             <w:rStyle w:val="Hyperlink"/>
@@ -11420,7 +11632,7 @@
       <w:r>
         <w:t xml:space="preserve">n: </w:t>
       </w:r>
-      <w:hyperlink r:id="rId34" w:history="1">
+      <w:hyperlink r:id="rId38" w:history="1">
         <w:r>
           <w:rPr>
             <w:rStyle w:val="Hyperlink"/>
@@ -11589,7 +11801,7 @@
       <w:r>
         <w:t xml:space="preserve">n: </w:t>
       </w:r>
-      <w:hyperlink r:id="rId35" w:history="1">
+      <w:hyperlink r:id="rId39" w:history="1">
         <w:r>
           <w:rPr>
             <w:rStyle w:val="Hyperlink"/>
@@ -11630,7 +11842,7 @@
       <w:r>
         <w:t xml:space="preserve">Recuperado de </w:t>
       </w:r>
-      <w:hyperlink r:id="rId36">
+      <w:hyperlink r:id="rId40">
         <w:r>
           <w:rPr>
             <w:rStyle w:val="Hyperlink"/>
@@ -11678,7 +11890,7 @@
       <w:r>
         <w:t xml:space="preserve">6). Manual de trabajos de grado de Especialización y Maestría y tesis doctorales. </w:t>
       </w:r>
-      <w:hyperlink r:id="rId37" w:history="1">
+      <w:hyperlink r:id="rId41" w:history="1">
         <w:r>
           <w:rPr>
             <w:rStyle w:val="Hyperlink"/>
@@ -11787,7 +11999,7 @@
       <w:r>
         <w:t xml:space="preserve">Disponible en: </w:t>
       </w:r>
-      <w:hyperlink r:id="rId38" w:history="1">
+      <w:hyperlink r:id="rId42" w:history="1">
         <w:r>
           <w:rPr>
             <w:rStyle w:val="Hyperlink"/>
@@ -11856,7 +12068,7 @@
         </w:rPr>
         <w:t xml:space="preserve">. Disponible en </w:t>
       </w:r>
-      <w:hyperlink r:id="rId39">
+      <w:hyperlink r:id="rId43">
         <w:r>
           <w:rPr>
             <w:rStyle w:val="Hyperlink"/>
@@ -11910,7 +12122,7 @@
         </w:rPr>
         <w:t xml:space="preserve"> Disponible en </w:t>
       </w:r>
-      <w:hyperlink r:id="rId40">
+      <w:hyperlink r:id="rId44">
         <w:r>
           <w:rPr>
             <w:rStyle w:val="Hyperlink"/>
@@ -11994,7 +12206,7 @@
         </w:rPr>
         <w:t xml:space="preserve"> </w:t>
       </w:r>
-      <w:hyperlink r:id="rId41">
+      <w:hyperlink r:id="rId45">
         <w:r>
           <w:rPr>
             <w:rStyle w:val="Hyperlink"/>
@@ -12100,7 +12312,7 @@
         </w:rPr>
         <w:t xml:space="preserve"> </w:t>
       </w:r>
-      <w:hyperlink r:id="rId42">
+      <w:hyperlink r:id="rId46">
         <w:r>
           <w:rPr>
             <w:rStyle w:val="Hyperlink"/>
@@ -12166,7 +12378,7 @@
       <w:r>
         <w:t xml:space="preserve">Recuperado 4 de julio de 2024, de  </w:t>
       </w:r>
-      <w:hyperlink r:id="rId43">
+      <w:hyperlink r:id="rId47">
         <w:r>
           <w:rPr>
             <w:rStyle w:val="Hyperlink"/>
@@ -12213,7 +12425,7 @@
       <w:r>
         <w:t xml:space="preserve"> </w:t>
       </w:r>
-      <w:hyperlink r:id="rId44">
+      <w:hyperlink r:id="rId48">
         <w:r>
           <w:rPr>
             <w:rStyle w:val="Hyperlink"/>
@@ -12280,7 +12492,7 @@
       <w:r>
         <w:t xml:space="preserve">Instituto de Investigaciones Bibliotecológicas y de la Información, UNAM. </w:t>
       </w:r>
-      <w:hyperlink r:id="rId45" w:history="1">
+      <w:hyperlink r:id="rId49" w:history="1">
         <w:r>
           <w:rPr>
             <w:rStyle w:val="Hyperlink"/>
@@ -12345,7 +12557,7 @@
       <w:r>
         <w:t xml:space="preserve"> Recuperado 3 de julio de 2024, de </w:t>
       </w:r>
-      <w:hyperlink r:id="rId46">
+      <w:hyperlink r:id="rId50">
         <w:r>
           <w:rPr>
             <w:rStyle w:val="Hyperlink"/>
@@ -12396,7 +12608,7 @@
         </w:rPr>
         <w:t xml:space="preserve">. Disponible en </w:t>
       </w:r>
-      <w:hyperlink r:id="rId47">
+      <w:hyperlink r:id="rId51">
         <w:r>
           <w:rPr>
             <w:rStyle w:val="Hyperlink"/>
@@ -12550,7 +12762,7 @@
       <w:r>
         <w:t xml:space="preserve"> Disponible en: </w:t>
       </w:r>
-      <w:hyperlink r:id="rId48">
+      <w:hyperlink r:id="rId52">
         <w:r>
           <w:rPr>
             <w:rStyle w:val="Hyperlink"/>
@@ -12588,7 +12800,7 @@
       <w:r>
         <w:br/>
       </w:r>
-      <w:hyperlink r:id="rId49" w:history="1">
+      <w:hyperlink r:id="rId53" w:history="1">
         <w:r>
           <w:rPr>
             <w:rStyle w:val="Hyperlink"/>
@@ -12604,7 +12816,7 @@
         <w:ind w:left="720" w:hanging="720"/>
         <w:jc w:val="both"/>
       </w:pPr>
-      <w:hyperlink r:id="rId50" w:history="1">
+      <w:hyperlink r:id="rId54" w:history="1">
         <w:r>
           <w:rPr>
             <w:rStyle w:val="Hyperlink"/>
@@ -12641,7 +12853,7 @@
     <w:p/>
     <w:p/>
     <w:sectPr>
-      <w:footerReference w:type="default" r:id="rId51"/>
+      <w:footerReference w:type="default" r:id="rId55"/>
       <w:pgSz w:w="12240" w:h="15840"/>
       <w:pgMar w:top="1985" w:right="1418" w:bottom="1418" w:left="1985" w:header="709" w:footer="709" w:gutter="0"/>
       <w:pgNumType w:start="1"/>
@@ -12650,6 +12862,45 @@
     </w:sectPr>
   </w:body>
 </w:document>
+</file>
+
+<file path=word/comments.xml><?xml version="1.0" encoding="utf-8"?>
+<w:comments xmlns:wpc="http://schemas.microsoft.com/office/word/2010/wordprocessingCanvas" xmlns:cx="http://schemas.microsoft.com/office/drawing/2014/chartex" xmlns:cx1="http://schemas.microsoft.com/office/drawing/2015/9/8/chartex" xmlns:cx2="http://schemas.microsoft.com/office/drawing/2015/10/21/chartex" xmlns:cx3="http://schemas.microsoft.com/office/drawing/2016/5/9/chartex" xmlns:cx4="http://schemas.microsoft.com/office/drawing/2016/5/10/chartex" xmlns:cx5="http://schemas.microsoft.com/office/drawing/2016/5/11/chartex" xmlns:cx6="http://schemas.microsoft.com/office/drawing/2016/5/12/chartex" xmlns:cx7="http://schemas.microsoft.com/office/drawing/2016/5/13/chartex" xmlns:cx8="http://schemas.microsoft.com/office/drawing/2016/5/14/chartex" xmlns:mc="http://schemas.openxmlformats.org/markup-compatibility/2006" xmlns:aink="http://schemas.microsoft.com/office/drawing/2016/ink" xmlns:am3d="http://schemas.microsoft.com/office/drawing/2017/model3d" xmlns:o="urn:schemas-microsoft-com:office:office" xmlns:oel="http://schemas.microsoft.com/office/2019/extlst" xmlns:r="http://schemas.openxmlformats.org/officeDocument/2006/relationships" xmlns:m="http://schemas.openxmlformats.org/officeDocument/2006/math" xmlns:v="urn:schemas-microsoft-com:vml" xmlns:wp14="http://schemas.microsoft.com/office/word/2010/wordprocessingDrawing" xmlns:wp="http://schemas.openxmlformats.org/drawingml/2006/wordprocessingDrawing" xmlns:w10="urn:schemas-microsoft-com:office:word" xmlns:w="http://schemas.openxmlformats.org/wordprocessingml/2006/main" xmlns:w14="http://schemas.microsoft.com/office/word/2010/wordml" xmlns:w15="http://schemas.microsoft.com/office/word/2012/wordml" xmlns:w16cex="http://schemas.microsoft.com/office/word/2018/wordml/cex" xmlns:w16cid="http://schemas.microsoft.com/office/word/2016/wordml/cid" xmlns:w16="http://schemas.microsoft.com/office/word/2018/wordml" xmlns:w16du="http://schemas.microsoft.com/office/word/2023/wordml/word16du" xmlns:w16sdtdh="http://schemas.microsoft.com/office/word/2020/wordml/sdtdatahash" xmlns:w16sdtfl="http://schemas.microsoft.com/office/word/2024/wordml/sdtformatlock" xmlns:w16se="http://schemas.microsoft.com/office/word/2015/wordml/symex" xmlns:wpg="http://schemas.microsoft.com/office/word/2010/wordprocessingGroup" xmlns:wpi="http://schemas.microsoft.com/office/word/2010/wordprocessingInk" xmlns:wne="http://schemas.microsoft.com/office/word/2006/wordml" xmlns:wps="http://schemas.microsoft.com/office/word/2010/wordprocessingShape" mc:Ignorable="w14 w15 w16se w16cid w16 w16cex w16sdtdh w16sdtfl w16du wp14">
+  <w:comment w:id="82" w:author="daniela alejandra cañas urbina" w:date="2025-10-13T20:37:00Z" w:initials="dc">
+    <w:p>
+      <w:pPr>
+        <w:pStyle w:val="CommentText"/>
+      </w:pPr>
+      <w:r>
+        <w:rPr>
+          <w:rStyle w:val="CommentReference"/>
+        </w:rPr>
+        <w:annotationRef/>
+      </w:r>
+      <w:r>
+        <w:t>No se si se tiene que colocar que ya se realizó</w:t>
+      </w:r>
+    </w:p>
+  </w:comment>
+</w:comments>
+</file>
+
+<file path=word/commentsExtended.xml><?xml version="1.0" encoding="utf-8"?>
+<w15:commentsEx xmlns:wpc="http://schemas.microsoft.com/office/word/2010/wordprocessingCanvas" xmlns:cx="http://schemas.microsoft.com/office/drawing/2014/chartex" xmlns:cx1="http://schemas.microsoft.com/office/drawing/2015/9/8/chartex" xmlns:cx2="http://schemas.microsoft.com/office/drawing/2015/10/21/chartex" xmlns:cx3="http://schemas.microsoft.com/office/drawing/2016/5/9/chartex" xmlns:cx4="http://schemas.microsoft.com/office/drawing/2016/5/10/chartex" xmlns:cx5="http://schemas.microsoft.com/office/drawing/2016/5/11/chartex" xmlns:cx6="http://schemas.microsoft.com/office/drawing/2016/5/12/chartex" xmlns:cx7="http://schemas.microsoft.com/office/drawing/2016/5/13/chartex" xmlns:cx8="http://schemas.microsoft.com/office/drawing/2016/5/14/chartex" xmlns:mc="http://schemas.openxmlformats.org/markup-compatibility/2006" xmlns:aink="http://schemas.microsoft.com/office/drawing/2016/ink" xmlns:am3d="http://schemas.microsoft.com/office/drawing/2017/model3d" xmlns:o="urn:schemas-microsoft-com:office:office" xmlns:oel="http://schemas.microsoft.com/office/2019/extlst" xmlns:r="http://schemas.openxmlformats.org/officeDocument/2006/relationships" xmlns:m="http://schemas.openxmlformats.org/officeDocument/2006/math" xmlns:v="urn:schemas-microsoft-com:vml" xmlns:wp14="http://schemas.microsoft.com/office/word/2010/wordprocessingDrawing" xmlns:wp="http://schemas.openxmlformats.org/drawingml/2006/wordprocessingDrawing" xmlns:w10="urn:schemas-microsoft-com:office:word" xmlns:w="http://schemas.openxmlformats.org/wordprocessingml/2006/main" xmlns:w14="http://schemas.microsoft.com/office/word/2010/wordml" xmlns:w15="http://schemas.microsoft.com/office/word/2012/wordml" xmlns:w16cex="http://schemas.microsoft.com/office/word/2018/wordml/cex" xmlns:w16cid="http://schemas.microsoft.com/office/word/2016/wordml/cid" xmlns:w16="http://schemas.microsoft.com/office/word/2018/wordml" xmlns:w16du="http://schemas.microsoft.com/office/word/2023/wordml/word16du" xmlns:w16sdtdh="http://schemas.microsoft.com/office/word/2020/wordml/sdtdatahash" xmlns:w16sdtfl="http://schemas.microsoft.com/office/word/2024/wordml/sdtformatlock" xmlns:w16se="http://schemas.microsoft.com/office/word/2015/wordml/symex" xmlns:wpg="http://schemas.microsoft.com/office/word/2010/wordprocessingGroup" xmlns:wpi="http://schemas.microsoft.com/office/word/2010/wordprocessingInk" xmlns:wne="http://schemas.microsoft.com/office/word/2006/wordml" xmlns:wps="http://schemas.microsoft.com/office/word/2010/wordprocessingShape" mc:Ignorable="w14 w15 w16se w16cid w16 w16cex w16sdtdh w16sdtfl w16du wp14">
+  <w15:commentEx w15:paraId="54960B64" w15:done="0"/>
+</w15:commentsEx>
+</file>
+
+<file path=word/commentsExtensible.xml><?xml version="1.0" encoding="utf-8"?>
+<w16cex:commentsExtensible xmlns:wpc="http://schemas.microsoft.com/office/word/2010/wordprocessingCanvas" xmlns:cx="http://schemas.microsoft.com/office/drawing/2014/chartex" xmlns:cx1="http://schemas.microsoft.com/office/drawing/2015/9/8/chartex" xmlns:cx2="http://schemas.microsoft.com/office/drawing/2015/10/21/chartex" xmlns:cx3="http://schemas.microsoft.com/office/drawing/2016/5/9/chartex" xmlns:cx4="http://schemas.microsoft.com/office/drawing/2016/5/10/chartex" xmlns:cx5="http://schemas.microsoft.com/office/drawing/2016/5/11/chartex" xmlns:cx6="http://schemas.microsoft.com/office/drawing/2016/5/12/chartex" xmlns:cx7="http://schemas.microsoft.com/office/drawing/2016/5/13/chartex" xmlns:cx8="http://schemas.microsoft.com/office/drawing/2016/5/14/chartex" xmlns:cr="http://schemas.microsoft.com/office/comments/2020/reactions" xmlns:mc="http://schemas.openxmlformats.org/markup-compatibility/2006" xmlns:aink="http://schemas.microsoft.com/office/drawing/2016/ink" xmlns:am3d="http://schemas.microsoft.com/office/drawing/2017/model3d" xmlns:o="urn:schemas-microsoft-com:office:office" xmlns:oel="http://schemas.microsoft.com/office/2019/extlst" xmlns:r="http://schemas.openxmlformats.org/officeDocument/2006/relationships" xmlns:m="http://schemas.openxmlformats.org/officeDocument/2006/math" xmlns:v="urn:schemas-microsoft-com:vml" xmlns:wp14="http://schemas.microsoft.com/office/word/2010/wordprocessingDrawing" xmlns:wp="http://schemas.openxmlformats.org/drawingml/2006/wordprocessingDrawing" xmlns:w10="urn:schemas-microsoft-com:office:word" xmlns:w="http://schemas.openxmlformats.org/wordprocessingml/2006/main" xmlns:w14="http://schemas.microsoft.com/office/word/2010/wordml" xmlns:w15="http://schemas.microsoft.com/office/word/2012/wordml" xmlns:w16cex="http://schemas.microsoft.com/office/word/2018/wordml/cex" xmlns:w16cid="http://schemas.microsoft.com/office/word/2016/wordml/cid" xmlns:w16="http://schemas.microsoft.com/office/word/2018/wordml" xmlns:w16du="http://schemas.microsoft.com/office/word/2023/wordml/word16du" xmlns:w16sdtdh="http://schemas.microsoft.com/office/word/2020/wordml/sdtdatahash" xmlns:w16sdtfl="http://schemas.microsoft.com/office/word/2024/wordml/sdtformatlock" xmlns:w16se="http://schemas.microsoft.com/office/word/2015/wordml/symex" xmlns:wpg="http://schemas.microsoft.com/office/word/2010/wordprocessingGroup" xmlns:wpi="http://schemas.microsoft.com/office/word/2010/wordprocessingInk" xmlns:wne="http://schemas.microsoft.com/office/word/2006/wordml" xmlns:wps="http://schemas.microsoft.com/office/word/2010/wordprocessingShape" mc:Ignorable="w14 w15 w16se w16cid w16 w16cex w16sdtdh w16sdtfl cr w16du wp14">
+  <w16cex:commentExtensible w16cex:durableId="39347E76" w16cex:dateUtc="2025-10-14T00:37:00Z"/>
+</w16cex:commentsExtensible>
+</file>
+
+<file path=word/commentsIds.xml><?xml version="1.0" encoding="utf-8"?>
+<w16cid:commentsIds xmlns:wpc="http://schemas.microsoft.com/office/word/2010/wordprocessingCanvas" xmlns:cx="http://schemas.microsoft.com/office/drawing/2014/chartex" xmlns:cx1="http://schemas.microsoft.com/office/drawing/2015/9/8/chartex" xmlns:cx2="http://schemas.microsoft.com/office/drawing/2015/10/21/chartex" xmlns:cx3="http://schemas.microsoft.com/office/drawing/2016/5/9/chartex" xmlns:cx4="http://schemas.microsoft.com/office/drawing/2016/5/10/chartex" xmlns:cx5="http://schemas.microsoft.com/office/drawing/2016/5/11/chartex" xmlns:cx6="http://schemas.microsoft.com/office/drawing/2016/5/12/chartex" xmlns:cx7="http://schemas.microsoft.com/office/drawing/2016/5/13/chartex" xmlns:cx8="http://schemas.microsoft.com/office/drawing/2016/5/14/chartex" xmlns:mc="http://schemas.openxmlformats.org/markup-compatibility/2006" xmlns:aink="http://schemas.microsoft.com/office/drawing/2016/ink" xmlns:am3d="http://schemas.microsoft.com/office/drawing/2017/model3d" xmlns:o="urn:schemas-microsoft-com:office:office" xmlns:oel="http://schemas.microsoft.com/office/2019/extlst" xmlns:r="http://schemas.openxmlformats.org/officeDocument/2006/relationships" xmlns:m="http://schemas.openxmlformats.org/officeDocument/2006/math" xmlns:v="urn:schemas-microsoft-com:vml" xmlns:wp14="http://schemas.microsoft.com/office/word/2010/wordprocessingDrawing" xmlns:wp="http://schemas.openxmlformats.org/drawingml/2006/wordprocessingDrawing" xmlns:w10="urn:schemas-microsoft-com:office:word" xmlns:w="http://schemas.openxmlformats.org/wordprocessingml/2006/main" xmlns:w14="http://schemas.microsoft.com/office/word/2010/wordml" xmlns:w15="http://schemas.microsoft.com/office/word/2012/wordml" xmlns:w16cex="http://schemas.microsoft.com/office/word/2018/wordml/cex" xmlns:w16cid="http://schemas.microsoft.com/office/word/2016/wordml/cid" xmlns:w16="http://schemas.microsoft.com/office/word/2018/wordml" xmlns:w16du="http://schemas.microsoft.com/office/word/2023/wordml/word16du" xmlns:w16sdtdh="http://schemas.microsoft.com/office/word/2020/wordml/sdtdatahash" xmlns:w16sdtfl="http://schemas.microsoft.com/office/word/2024/wordml/sdtformatlock" xmlns:w16se="http://schemas.microsoft.com/office/word/2015/wordml/symex" xmlns:wpg="http://schemas.microsoft.com/office/word/2010/wordprocessingGroup" xmlns:wpi="http://schemas.microsoft.com/office/word/2010/wordprocessingInk" xmlns:wne="http://schemas.microsoft.com/office/word/2006/wordml" xmlns:wps="http://schemas.microsoft.com/office/word/2010/wordprocessingShape" mc:Ignorable="w14 w15 w16se w16cid w16 w16cex w16sdtdh w16sdtfl w16du wp14">
+  <w16cid:commentId w16cid:paraId="54960B64" w16cid:durableId="39347E76"/>
+</w16cid:commentsIds>
 </file>
 
 <file path=word/endnotes.xml><?xml version="1.0" encoding="utf-8"?>
@@ -13206,6 +13457,118 @@
     </w:lvl>
   </w:abstractNum>
   <w:abstractNum w:abstractNumId="2" w15:restartNumberingAfterBreak="0">
+    <w:nsid w:val="37DA7515"/>
+    <w:multiLevelType w:val="hybridMultilevel"/>
+    <w:tmpl w:val="3B4A0CC6"/>
+    <w:lvl w:ilvl="0" w:tplc="04090001">
+      <w:start w:val="1"/>
+      <w:numFmt w:val="bullet"/>
+      <w:lvlText w:val=""/>
+      <w:lvlJc w:val="left"/>
+      <w:pPr>
+        <w:ind w:left="648" w:hanging="360"/>
+      </w:pPr>
+      <w:rPr>
+        <w:rFonts w:ascii="Symbol" w:hAnsi="Symbol" w:hint="default"/>
+      </w:rPr>
+    </w:lvl>
+    <w:lvl w:ilvl="1" w:tplc="5428F00E">
+      <w:numFmt w:val="bullet"/>
+      <w:lvlText w:val="-"/>
+      <w:lvlJc w:val="left"/>
+      <w:pPr>
+        <w:ind w:left="1368" w:hanging="360"/>
+      </w:pPr>
+      <w:rPr>
+        <w:rFonts w:ascii="Times New Roman" w:eastAsia="Aptos" w:hAnsi="Times New Roman" w:cs="Times New Roman" w:hint="default"/>
+      </w:rPr>
+    </w:lvl>
+    <w:lvl w:ilvl="2" w:tplc="FFFFFFFF" w:tentative="1">
+      <w:start w:val="1"/>
+      <w:numFmt w:val="bullet"/>
+      <w:lvlText w:val=""/>
+      <w:lvlJc w:val="left"/>
+      <w:pPr>
+        <w:ind w:left="2088" w:hanging="360"/>
+      </w:pPr>
+      <w:rPr>
+        <w:rFonts w:ascii="Wingdings" w:hAnsi="Wingdings" w:hint="default"/>
+      </w:rPr>
+    </w:lvl>
+    <w:lvl w:ilvl="3" w:tplc="FFFFFFFF" w:tentative="1">
+      <w:start w:val="1"/>
+      <w:numFmt w:val="bullet"/>
+      <w:lvlText w:val=""/>
+      <w:lvlJc w:val="left"/>
+      <w:pPr>
+        <w:ind w:left="2808" w:hanging="360"/>
+      </w:pPr>
+      <w:rPr>
+        <w:rFonts w:ascii="Symbol" w:hAnsi="Symbol" w:hint="default"/>
+      </w:rPr>
+    </w:lvl>
+    <w:lvl w:ilvl="4" w:tplc="FFFFFFFF" w:tentative="1">
+      <w:start w:val="1"/>
+      <w:numFmt w:val="bullet"/>
+      <w:lvlText w:val="o"/>
+      <w:lvlJc w:val="left"/>
+      <w:pPr>
+        <w:ind w:left="3528" w:hanging="360"/>
+      </w:pPr>
+      <w:rPr>
+        <w:rFonts w:ascii="Courier New" w:hAnsi="Courier New" w:cs="Courier New" w:hint="default"/>
+      </w:rPr>
+    </w:lvl>
+    <w:lvl w:ilvl="5" w:tplc="FFFFFFFF" w:tentative="1">
+      <w:start w:val="1"/>
+      <w:numFmt w:val="bullet"/>
+      <w:lvlText w:val=""/>
+      <w:lvlJc w:val="left"/>
+      <w:pPr>
+        <w:ind w:left="4248" w:hanging="360"/>
+      </w:pPr>
+      <w:rPr>
+        <w:rFonts w:ascii="Wingdings" w:hAnsi="Wingdings" w:hint="default"/>
+      </w:rPr>
+    </w:lvl>
+    <w:lvl w:ilvl="6" w:tplc="FFFFFFFF" w:tentative="1">
+      <w:start w:val="1"/>
+      <w:numFmt w:val="bullet"/>
+      <w:lvlText w:val=""/>
+      <w:lvlJc w:val="left"/>
+      <w:pPr>
+        <w:ind w:left="4968" w:hanging="360"/>
+      </w:pPr>
+      <w:rPr>
+        <w:rFonts w:ascii="Symbol" w:hAnsi="Symbol" w:hint="default"/>
+      </w:rPr>
+    </w:lvl>
+    <w:lvl w:ilvl="7" w:tplc="FFFFFFFF" w:tentative="1">
+      <w:start w:val="1"/>
+      <w:numFmt w:val="bullet"/>
+      <w:lvlText w:val="o"/>
+      <w:lvlJc w:val="left"/>
+      <w:pPr>
+        <w:ind w:left="5688" w:hanging="360"/>
+      </w:pPr>
+      <w:rPr>
+        <w:rFonts w:ascii="Courier New" w:hAnsi="Courier New" w:cs="Courier New" w:hint="default"/>
+      </w:rPr>
+    </w:lvl>
+    <w:lvl w:ilvl="8" w:tplc="FFFFFFFF" w:tentative="1">
+      <w:start w:val="1"/>
+      <w:numFmt w:val="bullet"/>
+      <w:lvlText w:val=""/>
+      <w:lvlJc w:val="left"/>
+      <w:pPr>
+        <w:ind w:left="6408" w:hanging="360"/>
+      </w:pPr>
+      <w:rPr>
+        <w:rFonts w:ascii="Wingdings" w:hAnsi="Wingdings" w:hint="default"/>
+      </w:rPr>
+    </w:lvl>
+  </w:abstractNum>
+  <w:abstractNum w:abstractNumId="3" w15:restartNumberingAfterBreak="0">
     <w:nsid w:val="4F0E005A"/>
     <w:multiLevelType w:val="multilevel"/>
     <w:tmpl w:val="485A3AFC"/>
@@ -13354,7 +13717,7 @@
       </w:rPr>
     </w:lvl>
   </w:abstractNum>
-  <w:abstractNum w:abstractNumId="3" w15:restartNumberingAfterBreak="0">
+  <w:abstractNum w:abstractNumId="4" w15:restartNumberingAfterBreak="0">
     <w:nsid w:val="50686D13"/>
     <w:multiLevelType w:val="hybridMultilevel"/>
     <w:tmpl w:val="9BC08016"/>
@@ -13467,7 +13830,458 @@
       </w:rPr>
     </w:lvl>
   </w:abstractNum>
-  <w:abstractNum w:abstractNumId="4" w15:restartNumberingAfterBreak="0">
+  <w:abstractNum w:abstractNumId="5" w15:restartNumberingAfterBreak="0">
+    <w:nsid w:val="5A1B16CE"/>
+    <w:multiLevelType w:val="hybridMultilevel"/>
+    <w:tmpl w:val="06A40BFC"/>
+    <w:lvl w:ilvl="0" w:tplc="04090001">
+      <w:start w:val="1"/>
+      <w:numFmt w:val="bullet"/>
+      <w:lvlText w:val=""/>
+      <w:lvlJc w:val="left"/>
+      <w:pPr>
+        <w:ind w:left="1008" w:hanging="360"/>
+      </w:pPr>
+      <w:rPr>
+        <w:rFonts w:ascii="Symbol" w:hAnsi="Symbol" w:hint="default"/>
+      </w:rPr>
+    </w:lvl>
+    <w:lvl w:ilvl="1" w:tplc="04090003" w:tentative="1">
+      <w:start w:val="1"/>
+      <w:numFmt w:val="bullet"/>
+      <w:lvlText w:val="o"/>
+      <w:lvlJc w:val="left"/>
+      <w:pPr>
+        <w:ind w:left="1728" w:hanging="360"/>
+      </w:pPr>
+      <w:rPr>
+        <w:rFonts w:ascii="Courier New" w:hAnsi="Courier New" w:cs="Courier New" w:hint="default"/>
+      </w:rPr>
+    </w:lvl>
+    <w:lvl w:ilvl="2" w:tplc="04090005" w:tentative="1">
+      <w:start w:val="1"/>
+      <w:numFmt w:val="bullet"/>
+      <w:lvlText w:val=""/>
+      <w:lvlJc w:val="left"/>
+      <w:pPr>
+        <w:ind w:left="2448" w:hanging="360"/>
+      </w:pPr>
+      <w:rPr>
+        <w:rFonts w:ascii="Wingdings" w:hAnsi="Wingdings" w:hint="default"/>
+      </w:rPr>
+    </w:lvl>
+    <w:lvl w:ilvl="3" w:tplc="04090001" w:tentative="1">
+      <w:start w:val="1"/>
+      <w:numFmt w:val="bullet"/>
+      <w:lvlText w:val=""/>
+      <w:lvlJc w:val="left"/>
+      <w:pPr>
+        <w:ind w:left="3168" w:hanging="360"/>
+      </w:pPr>
+      <w:rPr>
+        <w:rFonts w:ascii="Symbol" w:hAnsi="Symbol" w:hint="default"/>
+      </w:rPr>
+    </w:lvl>
+    <w:lvl w:ilvl="4" w:tplc="04090003" w:tentative="1">
+      <w:start w:val="1"/>
+      <w:numFmt w:val="bullet"/>
+      <w:lvlText w:val="o"/>
+      <w:lvlJc w:val="left"/>
+      <w:pPr>
+        <w:ind w:left="3888" w:hanging="360"/>
+      </w:pPr>
+      <w:rPr>
+        <w:rFonts w:ascii="Courier New" w:hAnsi="Courier New" w:cs="Courier New" w:hint="default"/>
+      </w:rPr>
+    </w:lvl>
+    <w:lvl w:ilvl="5" w:tplc="04090005" w:tentative="1">
+      <w:start w:val="1"/>
+      <w:numFmt w:val="bullet"/>
+      <w:lvlText w:val=""/>
+      <w:lvlJc w:val="left"/>
+      <w:pPr>
+        <w:ind w:left="4608" w:hanging="360"/>
+      </w:pPr>
+      <w:rPr>
+        <w:rFonts w:ascii="Wingdings" w:hAnsi="Wingdings" w:hint="default"/>
+      </w:rPr>
+    </w:lvl>
+    <w:lvl w:ilvl="6" w:tplc="04090001" w:tentative="1">
+      <w:start w:val="1"/>
+      <w:numFmt w:val="bullet"/>
+      <w:lvlText w:val=""/>
+      <w:lvlJc w:val="left"/>
+      <w:pPr>
+        <w:ind w:left="5328" w:hanging="360"/>
+      </w:pPr>
+      <w:rPr>
+        <w:rFonts w:ascii="Symbol" w:hAnsi="Symbol" w:hint="default"/>
+      </w:rPr>
+    </w:lvl>
+    <w:lvl w:ilvl="7" w:tplc="04090003" w:tentative="1">
+      <w:start w:val="1"/>
+      <w:numFmt w:val="bullet"/>
+      <w:lvlText w:val="o"/>
+      <w:lvlJc w:val="left"/>
+      <w:pPr>
+        <w:ind w:left="6048" w:hanging="360"/>
+      </w:pPr>
+      <w:rPr>
+        <w:rFonts w:ascii="Courier New" w:hAnsi="Courier New" w:cs="Courier New" w:hint="default"/>
+      </w:rPr>
+    </w:lvl>
+    <w:lvl w:ilvl="8" w:tplc="04090005" w:tentative="1">
+      <w:start w:val="1"/>
+      <w:numFmt w:val="bullet"/>
+      <w:lvlText w:val=""/>
+      <w:lvlJc w:val="left"/>
+      <w:pPr>
+        <w:ind w:left="6768" w:hanging="360"/>
+      </w:pPr>
+      <w:rPr>
+        <w:rFonts w:ascii="Wingdings" w:hAnsi="Wingdings" w:hint="default"/>
+      </w:rPr>
+    </w:lvl>
+  </w:abstractNum>
+  <w:abstractNum w:abstractNumId="6" w15:restartNumberingAfterBreak="0">
+    <w:nsid w:val="618205A8"/>
+    <w:multiLevelType w:val="hybridMultilevel"/>
+    <w:tmpl w:val="129AFD94"/>
+    <w:lvl w:ilvl="0" w:tplc="0409000F">
+      <w:start w:val="1"/>
+      <w:numFmt w:val="decimal"/>
+      <w:lvlText w:val="%1."/>
+      <w:lvlJc w:val="left"/>
+      <w:pPr>
+        <w:ind w:left="648" w:hanging="360"/>
+      </w:pPr>
+      <w:rPr>
+        <w:rFonts w:hint="default"/>
+      </w:rPr>
+    </w:lvl>
+    <w:lvl w:ilvl="1" w:tplc="FFFFFFFF" w:tentative="1">
+      <w:start w:val="1"/>
+      <w:numFmt w:val="bullet"/>
+      <w:lvlText w:val="o"/>
+      <w:lvlJc w:val="left"/>
+      <w:pPr>
+        <w:ind w:left="1368" w:hanging="360"/>
+      </w:pPr>
+      <w:rPr>
+        <w:rFonts w:ascii="Courier New" w:hAnsi="Courier New" w:cs="Courier New" w:hint="default"/>
+      </w:rPr>
+    </w:lvl>
+    <w:lvl w:ilvl="2" w:tplc="FFFFFFFF" w:tentative="1">
+      <w:start w:val="1"/>
+      <w:numFmt w:val="bullet"/>
+      <w:lvlText w:val=""/>
+      <w:lvlJc w:val="left"/>
+      <w:pPr>
+        <w:ind w:left="2088" w:hanging="360"/>
+      </w:pPr>
+      <w:rPr>
+        <w:rFonts w:ascii="Wingdings" w:hAnsi="Wingdings" w:hint="default"/>
+      </w:rPr>
+    </w:lvl>
+    <w:lvl w:ilvl="3" w:tplc="FFFFFFFF" w:tentative="1">
+      <w:start w:val="1"/>
+      <w:numFmt w:val="bullet"/>
+      <w:lvlText w:val=""/>
+      <w:lvlJc w:val="left"/>
+      <w:pPr>
+        <w:ind w:left="2808" w:hanging="360"/>
+      </w:pPr>
+      <w:rPr>
+        <w:rFonts w:ascii="Symbol" w:hAnsi="Symbol" w:hint="default"/>
+      </w:rPr>
+    </w:lvl>
+    <w:lvl w:ilvl="4" w:tplc="FFFFFFFF" w:tentative="1">
+      <w:start w:val="1"/>
+      <w:numFmt w:val="bullet"/>
+      <w:lvlText w:val="o"/>
+      <w:lvlJc w:val="left"/>
+      <w:pPr>
+        <w:ind w:left="3528" w:hanging="360"/>
+      </w:pPr>
+      <w:rPr>
+        <w:rFonts w:ascii="Courier New" w:hAnsi="Courier New" w:cs="Courier New" w:hint="default"/>
+      </w:rPr>
+    </w:lvl>
+    <w:lvl w:ilvl="5" w:tplc="FFFFFFFF" w:tentative="1">
+      <w:start w:val="1"/>
+      <w:numFmt w:val="bullet"/>
+      <w:lvlText w:val=""/>
+      <w:lvlJc w:val="left"/>
+      <w:pPr>
+        <w:ind w:left="4248" w:hanging="360"/>
+      </w:pPr>
+      <w:rPr>
+        <w:rFonts w:ascii="Wingdings" w:hAnsi="Wingdings" w:hint="default"/>
+      </w:rPr>
+    </w:lvl>
+    <w:lvl w:ilvl="6" w:tplc="FFFFFFFF" w:tentative="1">
+      <w:start w:val="1"/>
+      <w:numFmt w:val="bullet"/>
+      <w:lvlText w:val=""/>
+      <w:lvlJc w:val="left"/>
+      <w:pPr>
+        <w:ind w:left="4968" w:hanging="360"/>
+      </w:pPr>
+      <w:rPr>
+        <w:rFonts w:ascii="Symbol" w:hAnsi="Symbol" w:hint="default"/>
+      </w:rPr>
+    </w:lvl>
+    <w:lvl w:ilvl="7" w:tplc="FFFFFFFF" w:tentative="1">
+      <w:start w:val="1"/>
+      <w:numFmt w:val="bullet"/>
+      <w:lvlText w:val="o"/>
+      <w:lvlJc w:val="left"/>
+      <w:pPr>
+        <w:ind w:left="5688" w:hanging="360"/>
+      </w:pPr>
+      <w:rPr>
+        <w:rFonts w:ascii="Courier New" w:hAnsi="Courier New" w:cs="Courier New" w:hint="default"/>
+      </w:rPr>
+    </w:lvl>
+    <w:lvl w:ilvl="8" w:tplc="FFFFFFFF" w:tentative="1">
+      <w:start w:val="1"/>
+      <w:numFmt w:val="bullet"/>
+      <w:lvlText w:val=""/>
+      <w:lvlJc w:val="left"/>
+      <w:pPr>
+        <w:ind w:left="6408" w:hanging="360"/>
+      </w:pPr>
+      <w:rPr>
+        <w:rFonts w:ascii="Wingdings" w:hAnsi="Wingdings" w:hint="default"/>
+      </w:rPr>
+    </w:lvl>
+  </w:abstractNum>
+  <w:abstractNum w:abstractNumId="7" w15:restartNumberingAfterBreak="0">
+    <w:nsid w:val="691B0356"/>
+    <w:multiLevelType w:val="hybridMultilevel"/>
+    <w:tmpl w:val="07E086D4"/>
+    <w:lvl w:ilvl="0" w:tplc="501CBC0E">
+      <w:numFmt w:val="bullet"/>
+      <w:lvlText w:val="-"/>
+      <w:lvlJc w:val="left"/>
+      <w:pPr>
+        <w:ind w:left="648" w:hanging="360"/>
+      </w:pPr>
+      <w:rPr>
+        <w:rFonts w:ascii="Times New Roman" w:eastAsia="Aptos" w:hAnsi="Times New Roman" w:cs="Times New Roman" w:hint="default"/>
+      </w:rPr>
+    </w:lvl>
+    <w:lvl w:ilvl="1" w:tplc="04090003" w:tentative="1">
+      <w:start w:val="1"/>
+      <w:numFmt w:val="bullet"/>
+      <w:lvlText w:val="o"/>
+      <w:lvlJc w:val="left"/>
+      <w:pPr>
+        <w:ind w:left="1368" w:hanging="360"/>
+      </w:pPr>
+      <w:rPr>
+        <w:rFonts w:ascii="Courier New" w:hAnsi="Courier New" w:cs="Courier New" w:hint="default"/>
+      </w:rPr>
+    </w:lvl>
+    <w:lvl w:ilvl="2" w:tplc="04090005" w:tentative="1">
+      <w:start w:val="1"/>
+      <w:numFmt w:val="bullet"/>
+      <w:lvlText w:val=""/>
+      <w:lvlJc w:val="left"/>
+      <w:pPr>
+        <w:ind w:left="2088" w:hanging="360"/>
+      </w:pPr>
+      <w:rPr>
+        <w:rFonts w:ascii="Wingdings" w:hAnsi="Wingdings" w:hint="default"/>
+      </w:rPr>
+    </w:lvl>
+    <w:lvl w:ilvl="3" w:tplc="04090001" w:tentative="1">
+      <w:start w:val="1"/>
+      <w:numFmt w:val="bullet"/>
+      <w:lvlText w:val=""/>
+      <w:lvlJc w:val="left"/>
+      <w:pPr>
+        <w:ind w:left="2808" w:hanging="360"/>
+      </w:pPr>
+      <w:rPr>
+        <w:rFonts w:ascii="Symbol" w:hAnsi="Symbol" w:hint="default"/>
+      </w:rPr>
+    </w:lvl>
+    <w:lvl w:ilvl="4" w:tplc="04090003" w:tentative="1">
+      <w:start w:val="1"/>
+      <w:numFmt w:val="bullet"/>
+      <w:lvlText w:val="o"/>
+      <w:lvlJc w:val="left"/>
+      <w:pPr>
+        <w:ind w:left="3528" w:hanging="360"/>
+      </w:pPr>
+      <w:rPr>
+        <w:rFonts w:ascii="Courier New" w:hAnsi="Courier New" w:cs="Courier New" w:hint="default"/>
+      </w:rPr>
+    </w:lvl>
+    <w:lvl w:ilvl="5" w:tplc="04090005" w:tentative="1">
+      <w:start w:val="1"/>
+      <w:numFmt w:val="bullet"/>
+      <w:lvlText w:val=""/>
+      <w:lvlJc w:val="left"/>
+      <w:pPr>
+        <w:ind w:left="4248" w:hanging="360"/>
+      </w:pPr>
+      <w:rPr>
+        <w:rFonts w:ascii="Wingdings" w:hAnsi="Wingdings" w:hint="default"/>
+      </w:rPr>
+    </w:lvl>
+    <w:lvl w:ilvl="6" w:tplc="04090001" w:tentative="1">
+      <w:start w:val="1"/>
+      <w:numFmt w:val="bullet"/>
+      <w:lvlText w:val=""/>
+      <w:lvlJc w:val="left"/>
+      <w:pPr>
+        <w:ind w:left="4968" w:hanging="360"/>
+      </w:pPr>
+      <w:rPr>
+        <w:rFonts w:ascii="Symbol" w:hAnsi="Symbol" w:hint="default"/>
+      </w:rPr>
+    </w:lvl>
+    <w:lvl w:ilvl="7" w:tplc="04090003" w:tentative="1">
+      <w:start w:val="1"/>
+      <w:numFmt w:val="bullet"/>
+      <w:lvlText w:val="o"/>
+      <w:lvlJc w:val="left"/>
+      <w:pPr>
+        <w:ind w:left="5688" w:hanging="360"/>
+      </w:pPr>
+      <w:rPr>
+        <w:rFonts w:ascii="Courier New" w:hAnsi="Courier New" w:cs="Courier New" w:hint="default"/>
+      </w:rPr>
+    </w:lvl>
+    <w:lvl w:ilvl="8" w:tplc="04090005" w:tentative="1">
+      <w:start w:val="1"/>
+      <w:numFmt w:val="bullet"/>
+      <w:lvlText w:val=""/>
+      <w:lvlJc w:val="left"/>
+      <w:pPr>
+        <w:ind w:left="6408" w:hanging="360"/>
+      </w:pPr>
+      <w:rPr>
+        <w:rFonts w:ascii="Wingdings" w:hAnsi="Wingdings" w:hint="default"/>
+      </w:rPr>
+    </w:lvl>
+  </w:abstractNum>
+  <w:abstractNum w:abstractNumId="8" w15:restartNumberingAfterBreak="0">
+    <w:nsid w:val="6A8E1311"/>
+    <w:multiLevelType w:val="hybridMultilevel"/>
+    <w:tmpl w:val="F3301404"/>
+    <w:lvl w:ilvl="0" w:tplc="FFFFFFFF">
+      <w:start w:val="1"/>
+      <w:numFmt w:val="bullet"/>
+      <w:lvlText w:val=""/>
+      <w:lvlJc w:val="left"/>
+      <w:pPr>
+        <w:ind w:left="648" w:hanging="360"/>
+      </w:pPr>
+      <w:rPr>
+        <w:rFonts w:ascii="Symbol" w:hAnsi="Symbol" w:hint="default"/>
+      </w:rPr>
+    </w:lvl>
+    <w:lvl w:ilvl="1" w:tplc="04090001">
+      <w:start w:val="1"/>
+      <w:numFmt w:val="bullet"/>
+      <w:lvlText w:val=""/>
+      <w:lvlJc w:val="left"/>
+      <w:pPr>
+        <w:ind w:left="1368" w:hanging="360"/>
+      </w:pPr>
+      <w:rPr>
+        <w:rFonts w:ascii="Symbol" w:hAnsi="Symbol" w:hint="default"/>
+      </w:rPr>
+    </w:lvl>
+    <w:lvl w:ilvl="2" w:tplc="FFFFFFFF" w:tentative="1">
+      <w:start w:val="1"/>
+      <w:numFmt w:val="bullet"/>
+      <w:lvlText w:val=""/>
+      <w:lvlJc w:val="left"/>
+      <w:pPr>
+        <w:ind w:left="2088" w:hanging="360"/>
+      </w:pPr>
+      <w:rPr>
+        <w:rFonts w:ascii="Wingdings" w:hAnsi="Wingdings" w:hint="default"/>
+      </w:rPr>
+    </w:lvl>
+    <w:lvl w:ilvl="3" w:tplc="FFFFFFFF" w:tentative="1">
+      <w:start w:val="1"/>
+      <w:numFmt w:val="bullet"/>
+      <w:lvlText w:val=""/>
+      <w:lvlJc w:val="left"/>
+      <w:pPr>
+        <w:ind w:left="2808" w:hanging="360"/>
+      </w:pPr>
+      <w:rPr>
+        <w:rFonts w:ascii="Symbol" w:hAnsi="Symbol" w:hint="default"/>
+      </w:rPr>
+    </w:lvl>
+    <w:lvl w:ilvl="4" w:tplc="FFFFFFFF" w:tentative="1">
+      <w:start w:val="1"/>
+      <w:numFmt w:val="bullet"/>
+      <w:lvlText w:val="o"/>
+      <w:lvlJc w:val="left"/>
+      <w:pPr>
+        <w:ind w:left="3528" w:hanging="360"/>
+      </w:pPr>
+      <w:rPr>
+        <w:rFonts w:ascii="Courier New" w:hAnsi="Courier New" w:cs="Courier New" w:hint="default"/>
+      </w:rPr>
+    </w:lvl>
+    <w:lvl w:ilvl="5" w:tplc="FFFFFFFF" w:tentative="1">
+      <w:start w:val="1"/>
+      <w:numFmt w:val="bullet"/>
+      <w:lvlText w:val=""/>
+      <w:lvlJc w:val="left"/>
+      <w:pPr>
+        <w:ind w:left="4248" w:hanging="360"/>
+      </w:pPr>
+      <w:rPr>
+        <w:rFonts w:ascii="Wingdings" w:hAnsi="Wingdings" w:hint="default"/>
+      </w:rPr>
+    </w:lvl>
+    <w:lvl w:ilvl="6" w:tplc="FFFFFFFF" w:tentative="1">
+      <w:start w:val="1"/>
+      <w:numFmt w:val="bullet"/>
+      <w:lvlText w:val=""/>
+      <w:lvlJc w:val="left"/>
+      <w:pPr>
+        <w:ind w:left="4968" w:hanging="360"/>
+      </w:pPr>
+      <w:rPr>
+        <w:rFonts w:ascii="Symbol" w:hAnsi="Symbol" w:hint="default"/>
+      </w:rPr>
+    </w:lvl>
+    <w:lvl w:ilvl="7" w:tplc="FFFFFFFF" w:tentative="1">
+      <w:start w:val="1"/>
+      <w:numFmt w:val="bullet"/>
+      <w:lvlText w:val="o"/>
+      <w:lvlJc w:val="left"/>
+      <w:pPr>
+        <w:ind w:left="5688" w:hanging="360"/>
+      </w:pPr>
+      <w:rPr>
+        <w:rFonts w:ascii="Courier New" w:hAnsi="Courier New" w:cs="Courier New" w:hint="default"/>
+      </w:rPr>
+    </w:lvl>
+    <w:lvl w:ilvl="8" w:tplc="FFFFFFFF" w:tentative="1">
+      <w:start w:val="1"/>
+      <w:numFmt w:val="bullet"/>
+      <w:lvlText w:val=""/>
+      <w:lvlJc w:val="left"/>
+      <w:pPr>
+        <w:ind w:left="6408" w:hanging="360"/>
+      </w:pPr>
+      <w:rPr>
+        <w:rFonts w:ascii="Wingdings" w:hAnsi="Wingdings" w:hint="default"/>
+      </w:rPr>
+    </w:lvl>
+  </w:abstractNum>
+  <w:abstractNum w:abstractNumId="9" w15:restartNumberingAfterBreak="0">
     <w:nsid w:val="7D667DBB"/>
     <w:multiLevelType w:val="hybridMultilevel"/>
     <w:tmpl w:val="7E202A56"/>
@@ -13581,21 +14395,44 @@
     </w:lvl>
   </w:abstractNum>
   <w:num w:numId="1" w16cid:durableId="440927147">
-    <w:abstractNumId w:val="4"/>
+    <w:abstractNumId w:val="9"/>
   </w:num>
   <w:num w:numId="2" w16cid:durableId="1818836864">
     <w:abstractNumId w:val="1"/>
   </w:num>
   <w:num w:numId="3" w16cid:durableId="654723832">
-    <w:abstractNumId w:val="3"/>
+    <w:abstractNumId w:val="4"/>
   </w:num>
   <w:num w:numId="4" w16cid:durableId="1930389463">
     <w:abstractNumId w:val="0"/>
   </w:num>
   <w:num w:numId="5" w16cid:durableId="1406611160">
+    <w:abstractNumId w:val="3"/>
+  </w:num>
+  <w:num w:numId="6" w16cid:durableId="1220823954">
+    <w:abstractNumId w:val="5"/>
+  </w:num>
+  <w:num w:numId="7" w16cid:durableId="881987568">
+    <w:abstractNumId w:val="7"/>
+  </w:num>
+  <w:num w:numId="8" w16cid:durableId="517811062">
+    <w:abstractNumId w:val="6"/>
+  </w:num>
+  <w:num w:numId="9" w16cid:durableId="1911185109">
     <w:abstractNumId w:val="2"/>
   </w:num>
+  <w:num w:numId="10" w16cid:durableId="900823948">
+    <w:abstractNumId w:val="8"/>
+  </w:num>
 </w:numbering>
+</file>
+
+<file path=word/people.xml><?xml version="1.0" encoding="utf-8"?>
+<w15:people xmlns:wpc="http://schemas.microsoft.com/office/word/2010/wordprocessingCanvas" xmlns:cx="http://schemas.microsoft.com/office/drawing/2014/chartex" xmlns:cx1="http://schemas.microsoft.com/office/drawing/2015/9/8/chartex" xmlns:cx2="http://schemas.microsoft.com/office/drawing/2015/10/21/chartex" xmlns:cx3="http://schemas.microsoft.com/office/drawing/2016/5/9/chartex" xmlns:cx4="http://schemas.microsoft.com/office/drawing/2016/5/10/chartex" xmlns:cx5="http://schemas.microsoft.com/office/drawing/2016/5/11/chartex" xmlns:cx6="http://schemas.microsoft.com/office/drawing/2016/5/12/chartex" xmlns:cx7="http://schemas.microsoft.com/office/drawing/2016/5/13/chartex" xmlns:cx8="http://schemas.microsoft.com/office/drawing/2016/5/14/chartex" xmlns:mc="http://schemas.openxmlformats.org/markup-compatibility/2006" xmlns:aink="http://schemas.microsoft.com/office/drawing/2016/ink" xmlns:am3d="http://schemas.microsoft.com/office/drawing/2017/model3d" xmlns:o="urn:schemas-microsoft-com:office:office" xmlns:oel="http://schemas.microsoft.com/office/2019/extlst" xmlns:r="http://schemas.openxmlformats.org/officeDocument/2006/relationships" xmlns:m="http://schemas.openxmlformats.org/officeDocument/2006/math" xmlns:v="urn:schemas-microsoft-com:vml" xmlns:wp14="http://schemas.microsoft.com/office/word/2010/wordprocessingDrawing" xmlns:wp="http://schemas.openxmlformats.org/drawingml/2006/wordprocessingDrawing" xmlns:w10="urn:schemas-microsoft-com:office:word" xmlns:w="http://schemas.openxmlformats.org/wordprocessingml/2006/main" xmlns:w14="http://schemas.microsoft.com/office/word/2010/wordml" xmlns:w15="http://schemas.microsoft.com/office/word/2012/wordml" xmlns:w16cex="http://schemas.microsoft.com/office/word/2018/wordml/cex" xmlns:w16cid="http://schemas.microsoft.com/office/word/2016/wordml/cid" xmlns:w16="http://schemas.microsoft.com/office/word/2018/wordml" xmlns:w16du="http://schemas.microsoft.com/office/word/2023/wordml/word16du" xmlns:w16sdtdh="http://schemas.microsoft.com/office/word/2020/wordml/sdtdatahash" xmlns:w16sdtfl="http://schemas.microsoft.com/office/word/2024/wordml/sdtformatlock" xmlns:w16se="http://schemas.microsoft.com/office/word/2015/wordml/symex" xmlns:wpg="http://schemas.microsoft.com/office/word/2010/wordprocessingGroup" xmlns:wpi="http://schemas.microsoft.com/office/word/2010/wordprocessingInk" xmlns:wne="http://schemas.microsoft.com/office/word/2006/wordml" xmlns:wps="http://schemas.microsoft.com/office/word/2010/wordprocessingShape" mc:Ignorable="w14 w15 w16se w16cid w16 w16cex w16sdtdh w16sdtfl w16du wp14">
+  <w15:person w15:author="daniela alejandra cañas urbina">
+    <w15:presenceInfo w15:providerId="Windows Live" w15:userId="0523fed3e3944f0a"/>
+  </w15:person>
+</w15:people>
 </file>
 
 <file path=word/styles.xml><?xml version="1.0" encoding="utf-8"?>
@@ -15033,6 +15870,74 @@
       <w:shd w:val="clear" w:color="auto" w:fill="E1DFDD"/>
     </w:rPr>
   </w:style>
+  <w:style w:type="character" w:styleId="CommentReference">
+    <w:name w:val="annotation reference"/>
+    <w:basedOn w:val="DefaultParagraphFont"/>
+    <w:uiPriority w:val="99"/>
+    <w:semiHidden/>
+    <w:unhideWhenUsed/>
+    <w:rsid w:val="008B359F"/>
+    <w:rPr>
+      <w:sz w:val="16"/>
+      <w:szCs w:val="16"/>
+    </w:rPr>
+  </w:style>
+  <w:style w:type="paragraph" w:styleId="CommentText">
+    <w:name w:val="annotation text"/>
+    <w:basedOn w:val="Normal"/>
+    <w:link w:val="CommentTextChar"/>
+    <w:uiPriority w:val="99"/>
+    <w:unhideWhenUsed/>
+    <w:rsid w:val="008B359F"/>
+    <w:pPr>
+      <w:spacing w:line="240" w:lineRule="auto"/>
+    </w:pPr>
+    <w:rPr>
+      <w:sz w:val="20"/>
+      <w:szCs w:val="20"/>
+    </w:rPr>
+  </w:style>
+  <w:style w:type="character" w:customStyle="1" w:styleId="CommentTextChar">
+    <w:name w:val="Comment Text Char"/>
+    <w:basedOn w:val="DefaultParagraphFont"/>
+    <w:link w:val="CommentText"/>
+    <w:uiPriority w:val="99"/>
+    <w:rsid w:val="008B359F"/>
+    <w:rPr>
+      <w:rFonts w:ascii="Aptos" w:eastAsia="Aptos" w:hAnsi="Aptos" w:cs="SimSun"/>
+      <w:sz w:val="20"/>
+      <w:szCs w:val="20"/>
+    </w:rPr>
+  </w:style>
+  <w:style w:type="paragraph" w:styleId="CommentSubject">
+    <w:name w:val="annotation subject"/>
+    <w:basedOn w:val="CommentText"/>
+    <w:next w:val="CommentText"/>
+    <w:link w:val="CommentSubjectChar"/>
+    <w:uiPriority w:val="99"/>
+    <w:semiHidden/>
+    <w:unhideWhenUsed/>
+    <w:rsid w:val="008B359F"/>
+    <w:rPr>
+      <w:b/>
+      <w:bCs/>
+    </w:rPr>
+  </w:style>
+  <w:style w:type="character" w:customStyle="1" w:styleId="CommentSubjectChar">
+    <w:name w:val="Comment Subject Char"/>
+    <w:basedOn w:val="CommentTextChar"/>
+    <w:link w:val="CommentSubject"/>
+    <w:uiPriority w:val="99"/>
+    <w:semiHidden/>
+    <w:rsid w:val="008B359F"/>
+    <w:rPr>
+      <w:rFonts w:ascii="Aptos" w:eastAsia="Aptos" w:hAnsi="Aptos" w:cs="SimSun"/>
+      <w:b/>
+      <w:bCs/>
+      <w:sz w:val="20"/>
+      <w:szCs w:val="20"/>
+    </w:rPr>
+  </w:style>
 </w:styles>
 </file>
 

</xml_diff>